<commit_message>
Fix: Icon. Update: Membership form
</commit_message>
<xml_diff>
--- a/assets/2026.27MembershipformYOURNAMEv2.docx
+++ b/assets/2026.27MembershipformYOURNAMEv2.docx
@@ -1,6 +1,6 @@
 
 <file path=word/document.xml><?xml version="1.0" encoding="utf-8"?>
-<w:document xmlns:wpc="http://schemas.microsoft.com/office/word/2010/wordprocessingCanvas" xmlns:cx="http://schemas.microsoft.com/office/drawing/2014/chartex" xmlns:cx1="http://schemas.microsoft.com/office/drawing/2015/9/8/chartex" xmlns:cx2="http://schemas.microsoft.com/office/drawing/2015/10/21/chartex" xmlns:cx3="http://schemas.microsoft.com/office/drawing/2016/5/9/chartex" xmlns:cx4="http://schemas.microsoft.com/office/drawing/2016/5/10/chartex" xmlns:cx5="http://schemas.microsoft.com/office/drawing/2016/5/11/chartex" xmlns:cx6="http://schemas.microsoft.com/office/drawing/2016/5/12/chartex" xmlns:cx7="http://schemas.microsoft.com/office/drawing/2016/5/13/chartex" xmlns:cx8="http://schemas.microsoft.com/office/drawing/2016/5/14/chartex" xmlns:mc="http://schemas.openxmlformats.org/markup-compatibility/2006" xmlns:aink="http://schemas.microsoft.com/office/drawing/2016/ink" xmlns:am3d="http://schemas.microsoft.com/office/drawing/2017/model3d" xmlns:o="urn:schemas-microsoft-com:office:office" xmlns:oel="http://schemas.microsoft.com/office/2019/extlst" xmlns:r="http://schemas.openxmlformats.org/officeDocument/2006/relationships" xmlns:m="http://schemas.openxmlformats.org/officeDocument/2006/math" xmlns:v="urn:schemas-microsoft-com:vml" xmlns:wp14="http://schemas.microsoft.com/office/word/2010/wordprocessingDrawing" xmlns:wp="http://schemas.openxmlformats.org/drawingml/2006/wordprocessingDrawing" xmlns:w10="urn:schemas-microsoft-com:office:word" xmlns:w="http://schemas.openxmlformats.org/wordprocessingml/2006/main" xmlns:w14="http://schemas.microsoft.com/office/word/2010/wordml" xmlns:w15="http://schemas.microsoft.com/office/word/2012/wordml" xmlns:w16cei="http://schemas.microsoft.com/office/word/2026/wordml/cei" xmlns:w16cex="http://schemas.microsoft.com/office/word/2018/wordml/cex" xmlns:w16cid="http://schemas.microsoft.com/office/word/2016/wordml/cid" xmlns:w16="http://schemas.microsoft.com/office/word/2018/wordml" xmlns:w16du="http://schemas.microsoft.com/office/word/2023/wordml/word16du" xmlns:w16sdtdh="http://schemas.microsoft.com/office/word/2020/wordml/sdtdatahash" xmlns:w16sdtfl="http://schemas.microsoft.com/office/word/2024/wordml/sdtformatlock" xmlns:w16se="http://schemas.microsoft.com/office/word/2015/wordml/symex" xmlns:wpg="http://schemas.microsoft.com/office/word/2010/wordprocessingGroup" xmlns:wpi="http://schemas.microsoft.com/office/word/2010/wordprocessingInk" xmlns:wne="http://schemas.microsoft.com/office/word/2006/wordml" xmlns:wps="http://schemas.microsoft.com/office/word/2010/wordprocessingShape" mc:Ignorable="w14 w15 w16se w16cid w16 w16cex w16sdtdh w16sdtfl w16du wp14">
+<w:document xmlns:wpc="http://schemas.microsoft.com/office/word/2010/wordprocessingCanvas" xmlns:cx="http://schemas.microsoft.com/office/drawing/2014/chartex" xmlns:cx1="http://schemas.microsoft.com/office/drawing/2015/9/8/chartex" xmlns:cx2="http://schemas.microsoft.com/office/drawing/2015/10/21/chartex" xmlns:cx3="http://schemas.microsoft.com/office/drawing/2016/5/9/chartex" xmlns:cx4="http://schemas.microsoft.com/office/drawing/2016/5/10/chartex" xmlns:cx5="http://schemas.microsoft.com/office/drawing/2016/5/11/chartex" xmlns:cx6="http://schemas.microsoft.com/office/drawing/2016/5/12/chartex" xmlns:cx7="http://schemas.microsoft.com/office/drawing/2016/5/13/chartex" xmlns:cx8="http://schemas.microsoft.com/office/drawing/2016/5/14/chartex" xmlns:mc="http://schemas.openxmlformats.org/markup-compatibility/2006" xmlns:aink="http://schemas.microsoft.com/office/drawing/2016/ink" xmlns:am3d="http://schemas.microsoft.com/office/drawing/2017/model3d" xmlns:o="urn:schemas-microsoft-com:office:office" xmlns:oel="http://schemas.microsoft.com/office/2019/extlst" xmlns:r="http://schemas.openxmlformats.org/officeDocument/2006/relationships" xmlns:m="http://schemas.openxmlformats.org/officeDocument/2006/math" xmlns:v="urn:schemas-microsoft-com:vml" xmlns:wp14="http://schemas.microsoft.com/office/word/2010/wordprocessingDrawing" xmlns:wp="http://schemas.openxmlformats.org/drawingml/2006/wordprocessingDrawing" xmlns:w10="urn:schemas-microsoft-com:office:word" xmlns:w="http://schemas.openxmlformats.org/wordprocessingml/2006/main" xmlns:w14="http://schemas.microsoft.com/office/word/2010/wordml" xmlns:w15="http://schemas.microsoft.com/office/word/2012/wordml" xmlns:w16cex="http://schemas.microsoft.com/office/word/2018/wordml/cex" xmlns:w16cid="http://schemas.microsoft.com/office/word/2016/wordml/cid" xmlns:w16="http://schemas.microsoft.com/office/word/2018/wordml" xmlns:w16du="http://schemas.microsoft.com/office/word/2023/wordml/word16du" xmlns:w16sdtdh="http://schemas.microsoft.com/office/word/2020/wordml/sdtdatahash" xmlns:w16sdtfl="http://schemas.microsoft.com/office/word/2024/wordml/sdtformatlock" xmlns:w16se="http://schemas.microsoft.com/office/word/2015/wordml/symex" xmlns:wpg="http://schemas.microsoft.com/office/word/2010/wordprocessingGroup" xmlns:wpi="http://schemas.microsoft.com/office/word/2010/wordprocessingInk" xmlns:wne="http://schemas.microsoft.com/office/word/2006/wordml" xmlns:wps="http://schemas.microsoft.com/office/word/2010/wordprocessingShape" mc:Ignorable="w14 w15 w16se w16cid w16 w16cex w16sdtdh w16sdtfl w16du wp14">
   <w:body>
     <w:p>
       <w:pPr>
@@ -11,6 +11,188 @@
           <w:szCs w:val="20"/>
         </w:rPr>
       </w:pPr>
+      <w:r>
+        <w:rPr>
+          <w:b/>
+          <w:noProof/>
+          <w:color w:val="365F91" w:themeColor="accent1" w:themeShade="BF"/>
+          <w:sz w:val="32"/>
+          <w:szCs w:val="32"/>
+        </w:rPr>
+        <mc:AlternateContent>
+          <mc:Choice Requires="wps">
+            <w:drawing>
+              <wp:anchor distT="45720" distB="45720" distL="114300" distR="114300" simplePos="0" relativeHeight="251660800" behindDoc="0" locked="0" layoutInCell="1" allowOverlap="1" wp14:anchorId="3DFFB6CE" wp14:editId="3C914D0C">
+                <wp:simplePos x="0" y="0"/>
+                <wp:positionH relativeFrom="column">
+                  <wp:posOffset>3226153</wp:posOffset>
+                </wp:positionH>
+                <wp:positionV relativeFrom="paragraph">
+                  <wp:posOffset>7403</wp:posOffset>
+                </wp:positionV>
+                <wp:extent cx="2360930" cy="1404620"/>
+                <wp:effectExtent l="0" t="0" r="8890" b="9525"/>
+                <wp:wrapSquare wrapText="bothSides"/>
+                <wp:docPr id="217" name="Text Box 2"/>
+                <wp:cNvGraphicFramePr>
+                  <a:graphicFrameLocks xmlns:a="http://schemas.openxmlformats.org/drawingml/2006/main"/>
+                </wp:cNvGraphicFramePr>
+                <a:graphic xmlns:a="http://schemas.openxmlformats.org/drawingml/2006/main">
+                  <a:graphicData uri="http://schemas.microsoft.com/office/word/2010/wordprocessingShape">
+                    <wps:wsp>
+                      <wps:cNvSpPr txBox="1">
+                        <a:spLocks noChangeArrowheads="1"/>
+                      </wps:cNvSpPr>
+                      <wps:spPr bwMode="auto">
+                        <a:xfrm>
+                          <a:off x="0" y="0"/>
+                          <a:ext cx="2360930" cy="1404620"/>
+                        </a:xfrm>
+                        <a:prstGeom prst="rect">
+                          <a:avLst/>
+                        </a:prstGeom>
+                        <a:solidFill>
+                          <a:srgbClr val="FFFFFF"/>
+                        </a:solidFill>
+                        <a:ln w="9525">
+                          <a:noFill/>
+                          <a:miter lim="800000"/>
+                          <a:headEnd/>
+                          <a:tailEnd/>
+                        </a:ln>
+                      </wps:spPr>
+                      <wps:txbx>
+                        <w:txbxContent>
+                          <w:p>
+                            <w:r>
+                              <w:rPr>
+                                <w:noProof/>
+                              </w:rPr>
+                              <w:drawing>
+                                <wp:inline distT="0" distB="0" distL="0" distR="0" wp14:anchorId="0BB120F8" wp14:editId="12D712AE">
+                                  <wp:extent cx="2466041" cy="1452623"/>
+                                  <wp:effectExtent l="0" t="0" r="0" b="0"/>
+                                  <wp:docPr id="1103420192" name="Picture 3"/>
+                                  <wp:cNvGraphicFramePr>
+                                    <a:graphicFrameLocks xmlns:a="http://schemas.openxmlformats.org/drawingml/2006/main" noChangeAspect="1"/>
+                                  </wp:cNvGraphicFramePr>
+                                  <a:graphic xmlns:a="http://schemas.openxmlformats.org/drawingml/2006/main">
+                                    <a:graphicData uri="http://schemas.openxmlformats.org/drawingml/2006/picture">
+                                      <pic:pic xmlns:pic="http://schemas.openxmlformats.org/drawingml/2006/picture">
+                                        <pic:nvPicPr>
+                                          <pic:cNvPr id="1103420192" name="Picture 1103420192"/>
+                                          <pic:cNvPicPr/>
+                                        </pic:nvPicPr>
+                                        <pic:blipFill>
+                                          <a:blip r:embed="rId6">
+                                            <a:extLst>
+                                              <a:ext uri="{28A0092B-C50C-407E-A947-70E740481C1C}">
+                                                <a14:useLocalDpi xmlns:a14="http://schemas.microsoft.com/office/drawing/2010/main" val="0"/>
+                                              </a:ext>
+                                            </a:extLst>
+                                          </a:blip>
+                                          <a:stretch>
+                                            <a:fillRect/>
+                                          </a:stretch>
+                                        </pic:blipFill>
+                                        <pic:spPr>
+                                          <a:xfrm>
+                                            <a:off x="0" y="0"/>
+                                            <a:ext cx="2480779" cy="1461304"/>
+                                          </a:xfrm>
+                                          <a:prstGeom prst="rect">
+                                            <a:avLst/>
+                                          </a:prstGeom>
+                                        </pic:spPr>
+                                      </pic:pic>
+                                    </a:graphicData>
+                                  </a:graphic>
+                                </wp:inline>
+                              </w:drawing>
+                            </w:r>
+                          </w:p>
+                        </w:txbxContent>
+                      </wps:txbx>
+                      <wps:bodyPr rot="0" vert="horz" wrap="square" lIns="91440" tIns="45720" rIns="91440" bIns="45720" anchor="t" anchorCtr="0">
+                        <a:spAutoFit/>
+                      </wps:bodyPr>
+                    </wps:wsp>
+                  </a:graphicData>
+                </a:graphic>
+                <wp14:sizeRelH relativeFrom="margin">
+                  <wp14:pctWidth>40000</wp14:pctWidth>
+                </wp14:sizeRelH>
+                <wp14:sizeRelV relativeFrom="margin">
+                  <wp14:pctHeight>20000</wp14:pctHeight>
+                </wp14:sizeRelV>
+              </wp:anchor>
+            </w:drawing>
+          </mc:Choice>
+          <mc:Fallback>
+            <w:pict>
+              <v:shapetype w14:anchorId="3DFFB6CE" id="_x0000_t202" coordsize="21600,21600" o:spt="202" path="m,l,21600r21600,l21600,xe">
+                <v:stroke joinstyle="miter"/>
+                <v:path gradientshapeok="t" o:connecttype="rect"/>
+              </v:shapetype>
+              <v:shape id="Text Box 2" o:spid="_x0000_s1026" type="#_x0000_t202" style="position:absolute;margin-left:254.05pt;margin-top:.6pt;width:185.9pt;height:110.6pt;z-index:251660800;visibility:visible;mso-wrap-style:square;mso-width-percent:400;mso-height-percent:200;mso-wrap-distance-left:9pt;mso-wrap-distance-top:3.6pt;mso-wrap-distance-right:9pt;mso-wrap-distance-bottom:3.6pt;mso-position-horizontal:absolute;mso-position-horizontal-relative:text;mso-position-vertical:absolute;mso-position-vertical-relative:text;mso-width-percent:400;mso-height-percent:200;mso-width-relative:margin;mso-height-relative:margin;v-text-anchor:top" o:gfxdata="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" stroked="f">
+                <v:textbox style="mso-fit-shape-to-text:t">
+                  <w:txbxContent>
+                    <w:p>
+                      <w:r>
+                        <w:rPr>
+                          <w:noProof/>
+                        </w:rPr>
+                        <w:drawing>
+                          <wp:inline distT="0" distB="0" distL="0" distR="0" wp14:anchorId="0BB120F8" wp14:editId="12D712AE">
+                            <wp:extent cx="2466041" cy="1452623"/>
+                            <wp:effectExtent l="0" t="0" r="0" b="0"/>
+                            <wp:docPr id="1103420192" name="Picture 3"/>
+                            <wp:cNvGraphicFramePr>
+                              <a:graphicFrameLocks xmlns:a="http://schemas.openxmlformats.org/drawingml/2006/main" noChangeAspect="1"/>
+                            </wp:cNvGraphicFramePr>
+                            <a:graphic xmlns:a="http://schemas.openxmlformats.org/drawingml/2006/main">
+                              <a:graphicData uri="http://schemas.openxmlformats.org/drawingml/2006/picture">
+                                <pic:pic xmlns:pic="http://schemas.openxmlformats.org/drawingml/2006/picture">
+                                  <pic:nvPicPr>
+                                    <pic:cNvPr id="1103420192" name="Picture 1103420192"/>
+                                    <pic:cNvPicPr/>
+                                  </pic:nvPicPr>
+                                  <pic:blipFill>
+                                    <a:blip r:embed="rId6">
+                                      <a:extLst>
+                                        <a:ext uri="{28A0092B-C50C-407E-A947-70E740481C1C}">
+                                          <a14:useLocalDpi xmlns:a14="http://schemas.microsoft.com/office/drawing/2010/main" val="0"/>
+                                        </a:ext>
+                                      </a:extLst>
+                                    </a:blip>
+                                    <a:stretch>
+                                      <a:fillRect/>
+                                    </a:stretch>
+                                  </pic:blipFill>
+                                  <pic:spPr>
+                                    <a:xfrm>
+                                      <a:off x="0" y="0"/>
+                                      <a:ext cx="2480779" cy="1461304"/>
+                                    </a:xfrm>
+                                    <a:prstGeom prst="rect">
+                                      <a:avLst/>
+                                    </a:prstGeom>
+                                  </pic:spPr>
+                                </pic:pic>
+                              </a:graphicData>
+                            </a:graphic>
+                          </wp:inline>
+                        </w:drawing>
+                      </w:r>
+                    </w:p>
+                  </w:txbxContent>
+                </v:textbox>
+                <w10:wrap type="square"/>
+              </v:shape>
+            </w:pict>
+          </mc:Fallback>
+        </mc:AlternateContent>
+      </w:r>
     </w:p>
     <w:p>
       <w:pPr>
@@ -105,9 +287,9 @@
           <w:lang w:eastAsia="en-AU"/>
         </w:rPr>
         <w:drawing>
-          <wp:inline distT="0" distB="0" distL="0" distR="0" wp14:anchorId="532B17F9" wp14:editId="374383E0">
-            <wp:extent cx="990600" cy="988964"/>
-            <wp:effectExtent l="0" t="0" r="0" b="1905"/>
+          <wp:inline distT="0" distB="0" distL="0" distR="0" wp14:anchorId="532B17F9" wp14:editId="6B96A855">
+            <wp:extent cx="926669" cy="925139"/>
+            <wp:effectExtent l="0" t="0" r="6985" b="8890"/>
             <wp:docPr id="9" name="Picture 9"/>
             <wp:cNvGraphicFramePr>
               <a:graphicFrameLocks xmlns:a="http://schemas.openxmlformats.org/drawingml/2006/main" noChangeAspect="1"/>
@@ -117,62 +299,6 @@
                 <pic:pic xmlns:pic="http://schemas.openxmlformats.org/drawingml/2006/picture">
                   <pic:nvPicPr>
                     <pic:cNvPr id="9" name="2022-06-03_084613.jpg"/>
-                    <pic:cNvPicPr/>
-                  </pic:nvPicPr>
-                  <pic:blipFill>
-                    <a:blip r:embed="rId6" cstate="print">
-                      <a:extLst>
-                        <a:ext uri="{28A0092B-C50C-407E-A947-70E740481C1C}">
-                          <a14:useLocalDpi xmlns:a14="http://schemas.microsoft.com/office/drawing/2010/main" val="0"/>
-                        </a:ext>
-                      </a:extLst>
-                    </a:blip>
-                    <a:stretch>
-                      <a:fillRect/>
-                    </a:stretch>
-                  </pic:blipFill>
-                  <pic:spPr>
-                    <a:xfrm>
-                      <a:off x="0" y="0"/>
-                      <a:ext cx="1012580" cy="1010908"/>
-                    </a:xfrm>
-                    <a:prstGeom prst="rect">
-                      <a:avLst/>
-                    </a:prstGeom>
-                  </pic:spPr>
-                </pic:pic>
-              </a:graphicData>
-            </a:graphic>
-          </wp:inline>
-        </w:drawing>
-      </w:r>
-      <w:r>
-        <w:rPr>
-          <w:b/>
-          <w:color w:val="365F91" w:themeColor="accent1" w:themeShade="BF"/>
-          <w:sz w:val="32"/>
-          <w:szCs w:val="32"/>
-        </w:rPr>
-        <w:t xml:space="preserve">                          </w:t>
-      </w:r>
-      <w:r>
-        <w:rPr>
-          <w:noProof/>
-          <w:lang w:eastAsia="en-AU"/>
-        </w:rPr>
-        <w:drawing>
-          <wp:inline distT="0" distB="0" distL="0" distR="0" wp14:anchorId="3426E8BD" wp14:editId="53BB759F">
-            <wp:extent cx="1106552" cy="981075"/>
-            <wp:effectExtent l="0" t="0" r="0" b="0"/>
-            <wp:docPr id="3" name="Picture 3"/>
-            <wp:cNvGraphicFramePr>
-              <a:graphicFrameLocks xmlns:a="http://schemas.openxmlformats.org/drawingml/2006/main" noChangeAspect="1"/>
-            </wp:cNvGraphicFramePr>
-            <a:graphic xmlns:a="http://schemas.openxmlformats.org/drawingml/2006/main">
-              <a:graphicData uri="http://schemas.openxmlformats.org/drawingml/2006/picture">
-                <pic:pic xmlns:pic="http://schemas.openxmlformats.org/drawingml/2006/picture">
-                  <pic:nvPicPr>
-                    <pic:cNvPr id="2" name="mcsc logo.jpg"/>
                     <pic:cNvPicPr/>
                   </pic:nvPicPr>
                   <pic:blipFill>
@@ -190,7 +316,7 @@
                   <pic:spPr>
                     <a:xfrm>
                       <a:off x="0" y="0"/>
-                      <a:ext cx="1169898" cy="1037238"/>
+                      <a:ext cx="952791" cy="951218"/>
                     </a:xfrm>
                     <a:prstGeom prst="rect">
                       <a:avLst/>
@@ -202,6 +328,15 @@
           </wp:inline>
         </w:drawing>
       </w:r>
+      <w:r>
+        <w:rPr>
+          <w:b/>
+          <w:color w:val="365F91" w:themeColor="accent1" w:themeShade="BF"/>
+          <w:sz w:val="32"/>
+          <w:szCs w:val="32"/>
+        </w:rPr>
+        <w:t xml:space="preserve">               </w:t>
+      </w:r>
     </w:p>
     <w:p>
       <w:pPr>
@@ -211,541 +346,13 @@
         <w:jc w:val="center"/>
         <w:rPr>
           <w:rFonts w:ascii="Acme" w:hAnsi="Acme"/>
-          <w:color w:val="365F91" w:themeColor="accent1" w:themeShade="BF"/>
-          <w:sz w:val="32"/>
-          <w:szCs w:val="40"/>
+          <w:i/>
+          <w:color w:val="365F91" w:themeColor="accent1" w:themeShade="BF"/>
+          <w:sz w:val="28"/>
+          <w:szCs w:val="32"/>
+          <w:u w:val="single"/>
         </w:rPr>
       </w:pPr>
-      <w:r>
-        <w:rPr>
-          <w:rFonts w:ascii="Acme" w:hAnsi="Acme"/>
-          <w:i/>
-          <w:color w:val="365F91" w:themeColor="accent1" w:themeShade="BF"/>
-          <w:sz w:val="28"/>
-          <w:szCs w:val="32"/>
-          <w:u w:val="single"/>
-        </w:rPr>
-        <w:t xml:space="preserve">MCSC </w:t>
-      </w:r>
-      <w:r>
-        <w:rPr>
-          <w:rFonts w:ascii="Acme" w:hAnsi="Acme"/>
-          <w:i/>
-          <w:color w:val="365F91" w:themeColor="accent1" w:themeShade="BF"/>
-          <w:sz w:val="28"/>
-          <w:szCs w:val="32"/>
-          <w:u w:val="single"/>
-        </w:rPr>
-        <w:t>Membership</w:t>
-      </w:r>
-      <w:r>
-        <w:rPr>
-          <w:rFonts w:ascii="Acme" w:hAnsi="Acme"/>
-          <w:i/>
-          <w:color w:val="365F91" w:themeColor="accent1" w:themeShade="BF"/>
-          <w:sz w:val="28"/>
-          <w:szCs w:val="32"/>
-          <w:u w:val="single"/>
-        </w:rPr>
-        <w:t xml:space="preserve"> Form</w:t>
-      </w:r>
-      <w:r>
-        <w:rPr>
-          <w:rFonts w:ascii="Acme" w:hAnsi="Acme"/>
-          <w:i/>
-          <w:color w:val="365F91" w:themeColor="accent1" w:themeShade="BF"/>
-          <w:sz w:val="28"/>
-          <w:szCs w:val="32"/>
-          <w:u w:val="single"/>
-        </w:rPr>
-        <w:t xml:space="preserve"> 20</w:t>
-      </w:r>
-      <w:r>
-        <w:rPr>
-          <w:rFonts w:ascii="Acme" w:hAnsi="Acme"/>
-          <w:i/>
-          <w:color w:val="365F91" w:themeColor="accent1" w:themeShade="BF"/>
-          <w:sz w:val="28"/>
-          <w:szCs w:val="32"/>
-          <w:u w:val="single"/>
-        </w:rPr>
-        <w:t>2</w:t>
-      </w:r>
-      <w:r>
-        <w:rPr>
-          <w:rFonts w:ascii="Acme" w:hAnsi="Acme"/>
-          <w:i/>
-          <w:color w:val="365F91" w:themeColor="accent1" w:themeShade="BF"/>
-          <w:sz w:val="28"/>
-          <w:szCs w:val="32"/>
-          <w:u w:val="single"/>
-        </w:rPr>
-        <w:t>6</w:t>
-      </w:r>
-      <w:r>
-        <w:rPr>
-          <w:rFonts w:ascii="Acme" w:hAnsi="Acme"/>
-          <w:i/>
-          <w:color w:val="365F91" w:themeColor="accent1" w:themeShade="BF"/>
-          <w:sz w:val="28"/>
-          <w:szCs w:val="32"/>
-          <w:u w:val="single"/>
-        </w:rPr>
-        <w:t>/2</w:t>
-      </w:r>
-      <w:r>
-        <w:rPr>
-          <w:rFonts w:ascii="Acme" w:hAnsi="Acme"/>
-          <w:i/>
-          <w:color w:val="365F91" w:themeColor="accent1" w:themeShade="BF"/>
-          <w:sz w:val="28"/>
-          <w:szCs w:val="32"/>
-          <w:u w:val="single"/>
-        </w:rPr>
-        <w:t>7</w:t>
-      </w:r>
-      <w:r>
-        <w:rPr>
-          <w:rFonts w:ascii="Acme" w:hAnsi="Acme"/>
-          <w:color w:val="365F91" w:themeColor="accent1" w:themeShade="BF"/>
-          <w:sz w:val="28"/>
-          <w:szCs w:val="32"/>
-        </w:rPr>
-        <w:t xml:space="preserve"> </w:t>
-      </w:r>
-      <w:r>
-        <w:rPr>
-          <w:rFonts w:ascii="Acme" w:hAnsi="Acme"/>
-          <w:color w:val="365F91" w:themeColor="accent1" w:themeShade="BF"/>
-          <w:sz w:val="28"/>
-          <w:szCs w:val="32"/>
-        </w:rPr>
-        <w:t xml:space="preserve"> (</w:t>
-      </w:r>
-      <w:r>
-        <w:rPr>
-          <w:rFonts w:ascii="Acme" w:hAnsi="Acme"/>
-          <w:color w:val="FF0000"/>
-          <w:sz w:val="28"/>
-          <w:szCs w:val="32"/>
-          <w:u w:val="single"/>
-        </w:rPr>
-        <w:t>New members ONLY</w:t>
-      </w:r>
-      <w:r>
-        <w:rPr>
-          <w:rFonts w:ascii="Acme" w:hAnsi="Acme"/>
-          <w:color w:val="365F91" w:themeColor="accent1" w:themeShade="BF"/>
-          <w:sz w:val="28"/>
-          <w:szCs w:val="32"/>
-        </w:rPr>
-        <w:t>)</w:t>
-      </w:r>
-      <w:r>
-        <w:rPr>
-          <w:rFonts w:ascii="Acme" w:hAnsi="Acme"/>
-          <w:color w:val="365F91" w:themeColor="accent1" w:themeShade="BF"/>
-          <w:sz w:val="28"/>
-          <w:szCs w:val="32"/>
-        </w:rPr>
-        <w:br/>
-      </w:r>
-      <w:r>
-        <w:rPr>
-          <w:rFonts w:ascii="Acme" w:hAnsi="Acme"/>
-          <w:color w:val="365F91" w:themeColor="accent1" w:themeShade="BF"/>
-          <w:sz w:val="28"/>
-          <w:szCs w:val="32"/>
-        </w:rPr>
-        <w:br/>
-      </w:r>
-      <w:r>
-        <w:rPr>
-          <w:rFonts w:ascii="Acme" w:hAnsi="Acme"/>
-          <w:color w:val="365F91" w:themeColor="accent1" w:themeShade="BF"/>
-          <w:sz w:val="38"/>
-          <w:szCs w:val="36"/>
-          <w:u w:val="single"/>
-        </w:rPr>
-        <w:t>THINGS TO CHECK BEFORE YOU EMAIL THIS FORM</w:t>
-      </w:r>
-      <w:r>
-        <w:rPr>
-          <w:rFonts w:ascii="Acme" w:hAnsi="Acme"/>
-          <w:color w:val="365F91" w:themeColor="accent1" w:themeShade="BF"/>
-          <w:sz w:val="38"/>
-          <w:szCs w:val="36"/>
-          <w:u w:val="single"/>
-        </w:rPr>
-        <w:t xml:space="preserve"> TO US</w:t>
-      </w:r>
-      <w:r>
-        <w:rPr>
-          <w:rFonts w:ascii="Acme" w:hAnsi="Acme"/>
-          <w:color w:val="365F91" w:themeColor="accent1" w:themeShade="BF"/>
-          <w:sz w:val="40"/>
-          <w:szCs w:val="40"/>
-        </w:rPr>
-        <w:br/>
-      </w:r>
-      <w:r>
-        <w:rPr>
-          <w:rFonts w:ascii="Acme" w:hAnsi="Acme"/>
-          <w:color w:val="365F91" w:themeColor="accent1" w:themeShade="BF"/>
-          <w:sz w:val="38"/>
-          <w:szCs w:val="36"/>
-        </w:rPr>
-        <w:t>1. Have you changed the file name?</w:t>
-      </w:r>
-      <w:r>
-        <w:rPr>
-          <w:rFonts w:ascii="Acme" w:hAnsi="Acme"/>
-          <w:color w:val="365F91" w:themeColor="accent1" w:themeShade="BF"/>
-          <w:sz w:val="38"/>
-          <w:szCs w:val="36"/>
-        </w:rPr>
-        <w:br/>
-        <w:t>2. Have you cc’d the TWO club email addresses?</w:t>
-      </w:r>
-      <w:r>
-        <w:rPr>
-          <w:rFonts w:ascii="Acme" w:hAnsi="Acme"/>
-          <w:color w:val="365F91" w:themeColor="accent1" w:themeShade="BF"/>
-          <w:sz w:val="38"/>
-          <w:szCs w:val="36"/>
-        </w:rPr>
-        <w:br/>
-        <w:t>3. Have you paid the correct amount?</w:t>
-      </w:r>
-      <w:r>
-        <w:rPr>
-          <w:color w:val="365F91" w:themeColor="accent1" w:themeShade="BF"/>
-          <w:sz w:val="28"/>
-          <w:szCs w:val="32"/>
-        </w:rPr>
-        <w:br/>
-      </w:r>
-      <w:r>
-        <w:rPr>
-          <w:color w:val="365F91" w:themeColor="accent1" w:themeShade="BF"/>
-          <w:sz w:val="28"/>
-          <w:szCs w:val="32"/>
-        </w:rPr>
-        <w:br/>
-      </w:r>
-      <w:r>
-        <w:rPr>
-          <w:rFonts w:ascii="Acme" w:hAnsi="Acme"/>
-          <w:color w:val="365F91" w:themeColor="accent1" w:themeShade="BF"/>
-          <w:sz w:val="32"/>
-          <w:szCs w:val="40"/>
-        </w:rPr>
-        <w:t>P</w:t>
-      </w:r>
-      <w:r>
-        <w:rPr>
-          <w:rFonts w:ascii="Acme" w:hAnsi="Acme"/>
-          <w:color w:val="365F91" w:themeColor="accent1" w:themeShade="BF"/>
-          <w:sz w:val="32"/>
-          <w:szCs w:val="40"/>
-        </w:rPr>
-        <w:t xml:space="preserve">lease </w:t>
-      </w:r>
-      <w:r>
-        <w:rPr>
-          <w:rFonts w:ascii="Acme" w:hAnsi="Acme"/>
-          <w:color w:val="365F91" w:themeColor="accent1" w:themeShade="BF"/>
-          <w:sz w:val="32"/>
-          <w:szCs w:val="40"/>
-        </w:rPr>
-        <w:t xml:space="preserve">just </w:t>
-      </w:r>
-      <w:r>
-        <w:rPr>
-          <w:rFonts w:ascii="Acme" w:hAnsi="Acme"/>
-          <w:i/>
-          <w:sz w:val="32"/>
-          <w:szCs w:val="40"/>
-        </w:rPr>
-        <w:t>‘</w:t>
-      </w:r>
-      <w:r>
-        <w:rPr>
-          <w:rFonts w:ascii="Acme" w:hAnsi="Acme"/>
-          <w:i/>
-          <w:sz w:val="32"/>
-          <w:szCs w:val="40"/>
-        </w:rPr>
-        <w:t>EDIT</w:t>
-      </w:r>
-      <w:r>
-        <w:rPr>
-          <w:rFonts w:ascii="Acme" w:hAnsi="Acme"/>
-          <w:i/>
-          <w:sz w:val="32"/>
-          <w:szCs w:val="40"/>
-        </w:rPr>
-        <w:t>’</w:t>
-      </w:r>
-      <w:r>
-        <w:rPr>
-          <w:rFonts w:ascii="Acme" w:hAnsi="Acme"/>
-          <w:sz w:val="32"/>
-          <w:szCs w:val="40"/>
-        </w:rPr>
-        <w:t xml:space="preserve"> </w:t>
-      </w:r>
-      <w:r>
-        <w:rPr>
-          <w:rFonts w:ascii="Acme" w:hAnsi="Acme"/>
-          <w:color w:val="365F91" w:themeColor="accent1" w:themeShade="BF"/>
-          <w:sz w:val="32"/>
-          <w:szCs w:val="40"/>
-        </w:rPr>
-        <w:t>this doc</w:t>
-      </w:r>
-      <w:r>
-        <w:rPr>
-          <w:rFonts w:ascii="Acme" w:hAnsi="Acme"/>
-          <w:color w:val="365F91" w:themeColor="accent1" w:themeShade="BF"/>
-          <w:sz w:val="32"/>
-          <w:szCs w:val="40"/>
-        </w:rPr>
-        <w:t xml:space="preserve"> </w:t>
-      </w:r>
-      <w:r>
-        <w:rPr>
-          <w:rFonts w:ascii="Acme" w:hAnsi="Acme"/>
-          <w:color w:val="365F91" w:themeColor="accent1" w:themeShade="BF"/>
-          <w:sz w:val="32"/>
-          <w:szCs w:val="40"/>
-        </w:rPr>
-        <w:t>to add</w:t>
-      </w:r>
-      <w:r>
-        <w:rPr>
-          <w:rFonts w:ascii="Acme" w:hAnsi="Acme"/>
-          <w:color w:val="365F91" w:themeColor="accent1" w:themeShade="BF"/>
-          <w:sz w:val="32"/>
-          <w:szCs w:val="40"/>
-        </w:rPr>
-        <w:t xml:space="preserve"> your information</w:t>
-      </w:r>
-      <w:r>
-        <w:rPr>
-          <w:rFonts w:ascii="Acme" w:hAnsi="Acme"/>
-          <w:color w:val="365F91" w:themeColor="accent1" w:themeShade="BF"/>
-          <w:sz w:val="32"/>
-          <w:szCs w:val="40"/>
-        </w:rPr>
-        <w:t xml:space="preserve"> (don’t print and handwrite)</w:t>
-      </w:r>
-      <w:r>
-        <w:rPr>
-          <w:rFonts w:ascii="Acme" w:hAnsi="Acme"/>
-          <w:color w:val="365F91" w:themeColor="accent1" w:themeShade="BF"/>
-          <w:sz w:val="32"/>
-          <w:szCs w:val="40"/>
-        </w:rPr>
-        <w:br/>
-        <w:t xml:space="preserve">Please add some details about </w:t>
-      </w:r>
-      <w:r>
-        <w:rPr>
-          <w:rFonts w:ascii="Acme" w:hAnsi="Acme"/>
-          <w:color w:val="365F91" w:themeColor="accent1" w:themeShade="BF"/>
-          <w:sz w:val="32"/>
-          <w:szCs w:val="40"/>
-        </w:rPr>
-        <w:t>yourself</w:t>
-      </w:r>
-      <w:r>
-        <w:rPr>
-          <w:rFonts w:ascii="Acme" w:hAnsi="Acme"/>
-          <w:color w:val="365F91" w:themeColor="accent1" w:themeShade="BF"/>
-          <w:sz w:val="32"/>
-          <w:szCs w:val="40"/>
-        </w:rPr>
-        <w:t xml:space="preserve"> by answering these few </w:t>
-      </w:r>
-      <w:r>
-        <w:rPr>
-          <w:rFonts w:ascii="Acme" w:hAnsi="Acme"/>
-          <w:color w:val="365F91" w:themeColor="accent1" w:themeShade="BF"/>
-          <w:sz w:val="32"/>
-          <w:szCs w:val="40"/>
-        </w:rPr>
-        <w:t>questions</w:t>
-      </w:r>
-      <w:r>
-        <w:rPr>
-          <w:rFonts w:ascii="Acme" w:hAnsi="Acme"/>
-          <w:color w:val="365F91" w:themeColor="accent1" w:themeShade="BF"/>
-          <w:sz w:val="32"/>
-          <w:szCs w:val="40"/>
-        </w:rPr>
-        <w:br/>
-      </w:r>
-      <w:r>
-        <w:rPr>
-          <w:rFonts w:ascii="Acme" w:hAnsi="Acme"/>
-          <w:color w:val="365F91" w:themeColor="accent1" w:themeShade="BF"/>
-          <w:sz w:val="28"/>
-          <w:szCs w:val="32"/>
-        </w:rPr>
-        <w:t>If more than one person is on this form, then each person to complete these questions</w:t>
-      </w:r>
-      <w:r>
-        <w:rPr>
-          <w:rFonts w:ascii="Acme" w:hAnsi="Acme"/>
-          <w:color w:val="365F91" w:themeColor="accent1" w:themeShade="BF"/>
-          <w:sz w:val="32"/>
-          <w:szCs w:val="40"/>
-        </w:rPr>
-        <w:t>: -</w:t>
-      </w:r>
-    </w:p>
-    <w:p>
-      <w:pPr>
-        <w:pStyle w:val="Heading3"/>
-        <w:shd w:val="clear" w:color="auto" w:fill="FFFFFF"/>
-        <w:spacing w:line="300" w:lineRule="atLeast"/>
-        <w:rPr>
-          <w:rFonts w:ascii="Acme" w:hAnsi="Acme"/>
-          <w:color w:val="365F91" w:themeColor="accent1" w:themeShade="BF"/>
-          <w:sz w:val="32"/>
-          <w:szCs w:val="40"/>
-        </w:rPr>
-      </w:pPr>
-      <w:r>
-        <w:rPr>
-          <w:rFonts w:ascii="Calibri" w:hAnsi="Calibri" w:cs="Calibri"/>
-          <w:color w:val="333333"/>
-          <w:sz w:val="28"/>
-          <w:szCs w:val="28"/>
-          <w:highlight w:val="yellow"/>
-        </w:rPr>
-        <w:br/>
-      </w:r>
-      <w:r>
-        <w:rPr>
-          <w:rFonts w:ascii="Calibri" w:hAnsi="Calibri" w:cs="Calibri"/>
-          <w:sz w:val="28"/>
-          <w:szCs w:val="28"/>
-          <w:highlight w:val="yellow"/>
-        </w:rPr>
-        <w:t>1. What is your age?</w:t>
-      </w:r>
-      <w:r>
-        <w:rPr>
-          <w:rFonts w:ascii="Calibri" w:hAnsi="Calibri" w:cs="Calibri"/>
-          <w:sz w:val="28"/>
-          <w:szCs w:val="28"/>
-          <w:highlight w:val="yellow"/>
-        </w:rPr>
-        <w:t xml:space="preserve"> 18-30   31-40   41-50   50+</w:t>
-      </w:r>
-      <w:r>
-        <w:rPr>
-          <w:rFonts w:ascii="Calibri" w:hAnsi="Calibri" w:cs="Calibri"/>
-          <w:sz w:val="28"/>
-          <w:szCs w:val="28"/>
-          <w:highlight w:val="yellow"/>
-        </w:rPr>
-        <w:br/>
-      </w:r>
-      <w:r>
-        <w:rPr>
-          <w:rFonts w:ascii="Calibri" w:hAnsi="Calibri" w:cs="Calibri"/>
-          <w:sz w:val="28"/>
-          <w:szCs w:val="28"/>
-          <w:highlight w:val="yellow"/>
-        </w:rPr>
-        <w:br/>
-        <w:t>2. How long have you lived in Melbourne/Victoria?</w:t>
-      </w:r>
-      <w:r>
-        <w:rPr>
-          <w:rFonts w:ascii="Calibri" w:hAnsi="Calibri" w:cs="Calibri"/>
-          <w:sz w:val="28"/>
-          <w:szCs w:val="28"/>
-          <w:highlight w:val="yellow"/>
-        </w:rPr>
-        <w:br/>
-      </w:r>
-      <w:r>
-        <w:rPr>
-          <w:rFonts w:ascii="Calibri" w:hAnsi="Calibri" w:cs="Calibri"/>
-          <w:sz w:val="28"/>
-          <w:szCs w:val="28"/>
-          <w:highlight w:val="yellow"/>
-        </w:rPr>
-        <w:br/>
-        <w:t>3. What year did you start supporting Chelsea FC?</w:t>
-      </w:r>
-      <w:r>
-        <w:rPr>
-          <w:rFonts w:ascii="Calibri" w:hAnsi="Calibri" w:cs="Calibri"/>
-          <w:sz w:val="28"/>
-          <w:szCs w:val="28"/>
-          <w:highlight w:val="yellow"/>
-        </w:rPr>
-        <w:br/>
-      </w:r>
-      <w:r>
-        <w:rPr>
-          <w:rFonts w:ascii="Calibri" w:hAnsi="Calibri" w:cs="Calibri"/>
-          <w:sz w:val="28"/>
-          <w:szCs w:val="28"/>
-          <w:highlight w:val="yellow"/>
-        </w:rPr>
-        <w:br/>
-        <w:t>4. Have you already been buying the paid membership with CFC in London on a regular basis?</w:t>
-      </w:r>
-      <w:r>
-        <w:rPr>
-          <w:rFonts w:ascii="Calibri" w:hAnsi="Calibri" w:cs="Calibri"/>
-          <w:sz w:val="28"/>
-          <w:szCs w:val="28"/>
-          <w:highlight w:val="yellow"/>
-        </w:rPr>
-        <w:br/>
-      </w:r>
-      <w:r>
-        <w:rPr>
-          <w:rFonts w:ascii="Calibri" w:hAnsi="Calibri" w:cs="Calibri"/>
-          <w:sz w:val="28"/>
-          <w:szCs w:val="28"/>
-          <w:highlight w:val="yellow"/>
-        </w:rPr>
-        <w:br/>
-        <w:t>6. Do you follow any of our social media? If yes, which ones and how long for.</w:t>
-      </w:r>
-      <w:r>
-        <w:rPr>
-          <w:rFonts w:ascii="Calibri" w:hAnsi="Calibri" w:cs="Calibri"/>
-          <w:sz w:val="28"/>
-          <w:szCs w:val="28"/>
-          <w:highlight w:val="yellow"/>
-        </w:rPr>
-        <w:br/>
-      </w:r>
-      <w:r>
-        <w:rPr>
-          <w:rFonts w:ascii="Calibri" w:hAnsi="Calibri" w:cs="Calibri"/>
-          <w:highlight w:val="yellow"/>
-        </w:rPr>
-        <w:br/>
-      </w:r>
-      <w:r>
-        <w:rPr>
-          <w:rFonts w:ascii="Calibri" w:hAnsi="Calibri" w:cs="Calibri"/>
-          <w:sz w:val="28"/>
-          <w:szCs w:val="28"/>
-          <w:highlight w:val="yellow"/>
-        </w:rPr>
-        <w:t>7. Have you been to our chosen pub to watch Chelsea on TV in the city?</w:t>
-      </w:r>
     </w:p>
     <w:p>
       <w:pPr>
@@ -756,10 +363,240 @@
         <w:rPr>
           <w:rFonts w:ascii="Acme" w:hAnsi="Acme"/>
           <w:color w:val="365F91" w:themeColor="accent1" w:themeShade="BF"/>
+          <w:sz w:val="32"/>
+          <w:szCs w:val="40"/>
+        </w:rPr>
+      </w:pPr>
+      <w:r>
+        <w:rPr>
+          <w:rFonts w:ascii="Acme" w:hAnsi="Acme"/>
+          <w:i/>
+          <w:color w:val="365F91" w:themeColor="accent1" w:themeShade="BF"/>
+          <w:sz w:val="28"/>
+          <w:szCs w:val="32"/>
+          <w:u w:val="single"/>
+        </w:rPr>
+        <w:t xml:space="preserve">MCSC </w:t>
+      </w:r>
+      <w:r>
+        <w:rPr>
+          <w:rFonts w:ascii="Acme" w:hAnsi="Acme"/>
+          <w:i/>
+          <w:color w:val="365F91" w:themeColor="accent1" w:themeShade="BF"/>
+          <w:sz w:val="28"/>
+          <w:szCs w:val="32"/>
+          <w:u w:val="single"/>
+        </w:rPr>
+        <w:t>Membership</w:t>
+      </w:r>
+      <w:r>
+        <w:rPr>
+          <w:rFonts w:ascii="Acme" w:hAnsi="Acme"/>
+          <w:i/>
+          <w:color w:val="365F91" w:themeColor="accent1" w:themeShade="BF"/>
+          <w:sz w:val="28"/>
+          <w:szCs w:val="32"/>
+          <w:u w:val="single"/>
+        </w:rPr>
+        <w:t xml:space="preserve"> Form</w:t>
+      </w:r>
+      <w:r>
+        <w:rPr>
+          <w:rFonts w:ascii="Acme" w:hAnsi="Acme"/>
+          <w:i/>
+          <w:color w:val="365F91" w:themeColor="accent1" w:themeShade="BF"/>
+          <w:sz w:val="28"/>
+          <w:szCs w:val="32"/>
+          <w:u w:val="single"/>
+        </w:rPr>
+        <w:t xml:space="preserve"> 20</w:t>
+      </w:r>
+      <w:r>
+        <w:rPr>
+          <w:rFonts w:ascii="Acme" w:hAnsi="Acme"/>
+          <w:i/>
+          <w:color w:val="365F91" w:themeColor="accent1" w:themeShade="BF"/>
+          <w:sz w:val="28"/>
+          <w:szCs w:val="32"/>
+          <w:u w:val="single"/>
+        </w:rPr>
+        <w:t>2</w:t>
+      </w:r>
+      <w:r>
+        <w:rPr>
+          <w:rFonts w:ascii="Acme" w:hAnsi="Acme"/>
+          <w:i/>
+          <w:color w:val="365F91" w:themeColor="accent1" w:themeShade="BF"/>
+          <w:sz w:val="28"/>
+          <w:szCs w:val="32"/>
+          <w:u w:val="single"/>
+        </w:rPr>
+        <w:t>6</w:t>
+      </w:r>
+      <w:r>
+        <w:rPr>
+          <w:rFonts w:ascii="Acme" w:hAnsi="Acme"/>
+          <w:i/>
+          <w:color w:val="365F91" w:themeColor="accent1" w:themeShade="BF"/>
+          <w:sz w:val="28"/>
+          <w:szCs w:val="32"/>
+          <w:u w:val="single"/>
+        </w:rPr>
+        <w:t>/</w:t>
+      </w:r>
+      <w:proofErr w:type="gramStart"/>
+      <w:r>
+        <w:rPr>
+          <w:rFonts w:ascii="Acme" w:hAnsi="Acme"/>
+          <w:i/>
+          <w:color w:val="365F91" w:themeColor="accent1" w:themeShade="BF"/>
+          <w:sz w:val="28"/>
+          <w:szCs w:val="32"/>
+          <w:u w:val="single"/>
+        </w:rPr>
+        <w:t>2</w:t>
+      </w:r>
+      <w:r>
+        <w:rPr>
+          <w:rFonts w:ascii="Acme" w:hAnsi="Acme"/>
+          <w:i/>
+          <w:color w:val="365F91" w:themeColor="accent1" w:themeShade="BF"/>
+          <w:sz w:val="28"/>
+          <w:szCs w:val="32"/>
+          <w:u w:val="single"/>
+        </w:rPr>
+        <w:t>7</w:t>
+      </w:r>
+      <w:r>
+        <w:rPr>
+          <w:rFonts w:ascii="Acme" w:hAnsi="Acme"/>
+          <w:color w:val="365F91" w:themeColor="accent1" w:themeShade="BF"/>
+          <w:sz w:val="28"/>
+          <w:szCs w:val="32"/>
+        </w:rPr>
+        <w:t xml:space="preserve"> </w:t>
+      </w:r>
+      <w:r>
+        <w:rPr>
+          <w:rFonts w:ascii="Acme" w:hAnsi="Acme"/>
+          <w:color w:val="365F91" w:themeColor="accent1" w:themeShade="BF"/>
+          <w:sz w:val="28"/>
+          <w:szCs w:val="32"/>
+        </w:rPr>
+        <w:t xml:space="preserve"> (</w:t>
+      </w:r>
+      <w:proofErr w:type="gramEnd"/>
+      <w:r>
+        <w:rPr>
+          <w:rFonts w:ascii="Acme" w:hAnsi="Acme"/>
+          <w:color w:val="FF0000"/>
+          <w:sz w:val="28"/>
+          <w:szCs w:val="32"/>
+          <w:u w:val="single"/>
+        </w:rPr>
+        <w:t>New members ONLY</w:t>
+      </w:r>
+      <w:r>
+        <w:rPr>
+          <w:rFonts w:ascii="Acme" w:hAnsi="Acme"/>
+          <w:color w:val="365F91" w:themeColor="accent1" w:themeShade="BF"/>
+          <w:sz w:val="28"/>
+          <w:szCs w:val="32"/>
+        </w:rPr>
+        <w:t>)</w:t>
+      </w:r>
+      <w:r>
+        <w:rPr>
+          <w:rFonts w:ascii="Acme" w:hAnsi="Acme"/>
+          <w:color w:val="365F91" w:themeColor="accent1" w:themeShade="BF"/>
+          <w:sz w:val="28"/>
+          <w:szCs w:val="32"/>
+        </w:rPr>
+        <w:br/>
+      </w:r>
+      <w:r>
+        <w:rPr>
+          <w:rFonts w:ascii="Acme" w:hAnsi="Acme"/>
+          <w:color w:val="365F91" w:themeColor="accent1" w:themeShade="BF"/>
+          <w:sz w:val="28"/>
+          <w:szCs w:val="32"/>
+        </w:rPr>
+        <w:br/>
+      </w:r>
+      <w:r>
+        <w:rPr>
+          <w:rFonts w:ascii="Acme" w:hAnsi="Acme"/>
+          <w:color w:val="365F91" w:themeColor="accent1" w:themeShade="BF"/>
+          <w:sz w:val="38"/>
+          <w:szCs w:val="36"/>
+          <w:u w:val="single"/>
+        </w:rPr>
+        <w:t>THINGS TO CHECK BEFORE YOU EMAIL THIS FORM</w:t>
+      </w:r>
+      <w:r>
+        <w:rPr>
+          <w:rFonts w:ascii="Acme" w:hAnsi="Acme"/>
+          <w:color w:val="365F91" w:themeColor="accent1" w:themeShade="BF"/>
+          <w:sz w:val="38"/>
+          <w:szCs w:val="36"/>
+          <w:u w:val="single"/>
+        </w:rPr>
+        <w:t xml:space="preserve"> TO US</w:t>
+      </w:r>
+      <w:r>
+        <w:rPr>
+          <w:rFonts w:ascii="Acme" w:hAnsi="Acme"/>
+          <w:color w:val="365F91" w:themeColor="accent1" w:themeShade="BF"/>
           <w:sz w:val="40"/>
           <w:szCs w:val="40"/>
         </w:rPr>
-      </w:pPr>
+        <w:br/>
+      </w:r>
+      <w:r>
+        <w:rPr>
+          <w:rFonts w:ascii="Acme" w:hAnsi="Acme"/>
+          <w:color w:val="365F91" w:themeColor="accent1" w:themeShade="BF"/>
+          <w:sz w:val="38"/>
+          <w:szCs w:val="36"/>
+        </w:rPr>
+        <w:t>1. Have you changed the file name?</w:t>
+      </w:r>
+      <w:r>
+        <w:rPr>
+          <w:rFonts w:ascii="Acme" w:hAnsi="Acme"/>
+          <w:color w:val="365F91" w:themeColor="accent1" w:themeShade="BF"/>
+          <w:sz w:val="38"/>
+          <w:szCs w:val="36"/>
+        </w:rPr>
+        <w:br/>
+        <w:t>2. Have you cc’d the TWO club email addresses?</w:t>
+      </w:r>
+      <w:r>
+        <w:rPr>
+          <w:rFonts w:ascii="Acme" w:hAnsi="Acme"/>
+          <w:color w:val="365F91" w:themeColor="accent1" w:themeShade="BF"/>
+          <w:sz w:val="38"/>
+          <w:szCs w:val="36"/>
+        </w:rPr>
+        <w:br/>
+        <w:t>3. Have you paid the correct amount?</w:t>
+      </w:r>
+      <w:r>
+        <w:rPr>
+          <w:color w:val="365F91" w:themeColor="accent1" w:themeShade="BF"/>
+          <w:sz w:val="28"/>
+          <w:szCs w:val="32"/>
+        </w:rPr>
+        <w:br/>
+      </w:r>
+      <w:r>
+        <w:rPr>
+          <w:color w:val="365F91" w:themeColor="accent1" w:themeShade="BF"/>
+          <w:sz w:val="28"/>
+          <w:szCs w:val="32"/>
+        </w:rPr>
+        <w:br/>
+      </w:r>
       <w:r>
         <w:rPr>
           <w:rFonts w:ascii="Acme" w:hAnsi="Acme"/>
@@ -767,26 +604,513 @@
           <w:sz w:val="32"/>
           <w:szCs w:val="40"/>
         </w:rPr>
-        <w:br/>
-      </w:r>
-      <w:r>
-        <w:rPr>
-          <w:rFonts w:ascii="Acme" w:hAnsi="Acme"/>
-          <w:color w:val="365F91" w:themeColor="accent1" w:themeShade="BF"/>
-          <w:sz w:val="28"/>
-          <w:szCs w:val="32"/>
-        </w:rPr>
-        <w:br/>
-      </w:r>
-      <w:r>
-        <w:rPr>
-          <w:rFonts w:ascii="Acme" w:hAnsi="Acme"/>
-          <w:color w:val="365F91" w:themeColor="accent1" w:themeShade="BF"/>
-          <w:sz w:val="28"/>
-          <w:szCs w:val="32"/>
+        <w:t>P</w:t>
+      </w:r>
+      <w:r>
+        <w:rPr>
+          <w:rFonts w:ascii="Acme" w:hAnsi="Acme"/>
+          <w:color w:val="365F91" w:themeColor="accent1" w:themeShade="BF"/>
+          <w:sz w:val="32"/>
+          <w:szCs w:val="40"/>
+        </w:rPr>
+        <w:t xml:space="preserve">lease </w:t>
+      </w:r>
+      <w:r>
+        <w:rPr>
+          <w:rFonts w:ascii="Acme" w:hAnsi="Acme"/>
+          <w:color w:val="365F91" w:themeColor="accent1" w:themeShade="BF"/>
+          <w:sz w:val="32"/>
+          <w:szCs w:val="40"/>
+        </w:rPr>
+        <w:t xml:space="preserve">just </w:t>
+      </w:r>
+      <w:r>
+        <w:rPr>
+          <w:rFonts w:ascii="Acme" w:hAnsi="Acme"/>
+          <w:i/>
+          <w:sz w:val="32"/>
+          <w:szCs w:val="40"/>
+        </w:rPr>
+        <w:t>‘</w:t>
+      </w:r>
+      <w:r>
+        <w:rPr>
+          <w:rFonts w:ascii="Acme" w:hAnsi="Acme"/>
+          <w:i/>
+          <w:sz w:val="32"/>
+          <w:szCs w:val="40"/>
+        </w:rPr>
+        <w:t>EDIT</w:t>
+      </w:r>
+      <w:r>
+        <w:rPr>
+          <w:rFonts w:ascii="Acme" w:hAnsi="Acme"/>
+          <w:i/>
+          <w:sz w:val="32"/>
+          <w:szCs w:val="40"/>
+        </w:rPr>
+        <w:t>’</w:t>
+      </w:r>
+      <w:r>
+        <w:rPr>
+          <w:rFonts w:ascii="Acme" w:hAnsi="Acme"/>
+          <w:sz w:val="32"/>
+          <w:szCs w:val="40"/>
         </w:rPr>
         <w:t xml:space="preserve"> </w:t>
       </w:r>
+      <w:r>
+        <w:rPr>
+          <w:rFonts w:ascii="Acme" w:hAnsi="Acme"/>
+          <w:color w:val="365F91" w:themeColor="accent1" w:themeShade="BF"/>
+          <w:sz w:val="32"/>
+          <w:szCs w:val="40"/>
+        </w:rPr>
+        <w:t>this doc</w:t>
+      </w:r>
+      <w:r>
+        <w:rPr>
+          <w:rFonts w:ascii="Acme" w:hAnsi="Acme"/>
+          <w:color w:val="365F91" w:themeColor="accent1" w:themeShade="BF"/>
+          <w:sz w:val="32"/>
+          <w:szCs w:val="40"/>
+        </w:rPr>
+        <w:t xml:space="preserve"> </w:t>
+      </w:r>
+      <w:r>
+        <w:rPr>
+          <w:rFonts w:ascii="Acme" w:hAnsi="Acme"/>
+          <w:color w:val="365F91" w:themeColor="accent1" w:themeShade="BF"/>
+          <w:sz w:val="32"/>
+          <w:szCs w:val="40"/>
+        </w:rPr>
+        <w:t>to add</w:t>
+      </w:r>
+      <w:r>
+        <w:rPr>
+          <w:rFonts w:ascii="Acme" w:hAnsi="Acme"/>
+          <w:color w:val="365F91" w:themeColor="accent1" w:themeShade="BF"/>
+          <w:sz w:val="32"/>
+          <w:szCs w:val="40"/>
+        </w:rPr>
+        <w:t xml:space="preserve"> your information</w:t>
+      </w:r>
+      <w:r>
+        <w:rPr>
+          <w:rFonts w:ascii="Acme" w:hAnsi="Acme"/>
+          <w:color w:val="365F91" w:themeColor="accent1" w:themeShade="BF"/>
+          <w:sz w:val="32"/>
+          <w:szCs w:val="40"/>
+        </w:rPr>
+        <w:t xml:space="preserve"> (don’t print and handwrite)</w:t>
+      </w:r>
+      <w:r>
+        <w:rPr>
+          <w:rFonts w:ascii="Acme" w:hAnsi="Acme"/>
+          <w:color w:val="365F91" w:themeColor="accent1" w:themeShade="BF"/>
+          <w:sz w:val="32"/>
+          <w:szCs w:val="40"/>
+        </w:rPr>
+        <w:br/>
+        <w:t xml:space="preserve">Please add some details about </w:t>
+      </w:r>
+      <w:r>
+        <w:rPr>
+          <w:rFonts w:ascii="Acme" w:hAnsi="Acme"/>
+          <w:color w:val="365F91" w:themeColor="accent1" w:themeShade="BF"/>
+          <w:sz w:val="32"/>
+          <w:szCs w:val="40"/>
+        </w:rPr>
+        <w:t>yourself</w:t>
+      </w:r>
+      <w:r>
+        <w:rPr>
+          <w:rFonts w:ascii="Acme" w:hAnsi="Acme"/>
+          <w:color w:val="365F91" w:themeColor="accent1" w:themeShade="BF"/>
+          <w:sz w:val="32"/>
+          <w:szCs w:val="40"/>
+        </w:rPr>
+        <w:t xml:space="preserve"> by answering these few </w:t>
+      </w:r>
+      <w:r>
+        <w:rPr>
+          <w:rFonts w:ascii="Acme" w:hAnsi="Acme"/>
+          <w:color w:val="365F91" w:themeColor="accent1" w:themeShade="BF"/>
+          <w:sz w:val="32"/>
+          <w:szCs w:val="40"/>
+        </w:rPr>
+        <w:t>questions</w:t>
+      </w:r>
+      <w:r>
+        <w:rPr>
+          <w:rFonts w:ascii="Acme" w:hAnsi="Acme"/>
+          <w:color w:val="365F91" w:themeColor="accent1" w:themeShade="BF"/>
+          <w:sz w:val="32"/>
+          <w:szCs w:val="40"/>
+        </w:rPr>
+        <w:br/>
+      </w:r>
+      <w:r>
+        <w:rPr>
+          <w:rFonts w:ascii="Acme" w:hAnsi="Acme"/>
+          <w:color w:val="365F91" w:themeColor="accent1" w:themeShade="BF"/>
+          <w:sz w:val="28"/>
+          <w:szCs w:val="32"/>
+        </w:rPr>
+        <w:t xml:space="preserve">If more than one person is on this form, then </w:t>
+      </w:r>
+      <w:r>
+        <w:rPr>
+          <w:rFonts w:ascii="Acme" w:hAnsi="Acme"/>
+          <w:color w:val="365F91" w:themeColor="accent1" w:themeShade="BF"/>
+          <w:sz w:val="28"/>
+          <w:szCs w:val="32"/>
+          <w:highlight w:val="yellow"/>
+          <w:u w:val="single"/>
+        </w:rPr>
+        <w:t>each</w:t>
+      </w:r>
+      <w:r>
+        <w:rPr>
+          <w:rFonts w:ascii="Acme" w:hAnsi="Acme"/>
+          <w:color w:val="365F91" w:themeColor="accent1" w:themeShade="BF"/>
+          <w:sz w:val="28"/>
+          <w:szCs w:val="32"/>
+        </w:rPr>
+        <w:t xml:space="preserve"> person to complete these questions</w:t>
+      </w:r>
+      <w:r>
+        <w:rPr>
+          <w:rFonts w:ascii="Acme" w:hAnsi="Acme"/>
+          <w:color w:val="365F91" w:themeColor="accent1" w:themeShade="BF"/>
+          <w:sz w:val="32"/>
+          <w:szCs w:val="40"/>
+        </w:rPr>
+        <w:t>: -</w:t>
+      </w:r>
+    </w:p>
+    <w:p>
+      <w:pPr>
+        <w:pStyle w:val="Heading3"/>
+        <w:shd w:val="clear" w:color="auto" w:fill="FFFFFF"/>
+        <w:spacing w:line="300" w:lineRule="atLeast"/>
+        <w:jc w:val="center"/>
+        <w:rPr>
+          <w:rFonts w:ascii="Calibri" w:hAnsi="Calibri" w:cs="Calibri"/>
+          <w:sz w:val="24"/>
+          <w:szCs w:val="24"/>
+        </w:rPr>
+      </w:pPr>
+      <w:r>
+        <w:rPr>
+          <w:rFonts w:ascii="Calibri" w:hAnsi="Calibri" w:cs="Calibri"/>
+          <w:color w:val="333333"/>
+          <w:sz w:val="28"/>
+          <w:szCs w:val="28"/>
+          <w:highlight w:val="yellow"/>
+        </w:rPr>
+        <w:br/>
+      </w:r>
+      <w:r>
+        <w:rPr>
+          <w:rFonts w:ascii="Calibri" w:hAnsi="Calibri" w:cs="Calibri"/>
+          <w:sz w:val="24"/>
+          <w:szCs w:val="24"/>
+          <w:highlight w:val="yellow"/>
+        </w:rPr>
+        <w:t>1. What is your age</w:t>
+      </w:r>
+      <w:r>
+        <w:rPr>
+          <w:rFonts w:ascii="Calibri" w:hAnsi="Calibri" w:cs="Calibri"/>
+          <w:sz w:val="24"/>
+          <w:szCs w:val="24"/>
+          <w:highlight w:val="yellow"/>
+        </w:rPr>
+        <w:t>, which range</w:t>
+      </w:r>
+      <w:r>
+        <w:rPr>
+          <w:rFonts w:ascii="Calibri" w:hAnsi="Calibri" w:cs="Calibri"/>
+          <w:sz w:val="24"/>
+          <w:szCs w:val="24"/>
+          <w:highlight w:val="yellow"/>
+        </w:rPr>
+        <w:t>? 18-30   31-40   41-50   50+</w:t>
+      </w:r>
+      <w:r>
+        <w:rPr>
+          <w:rFonts w:ascii="Calibri" w:hAnsi="Calibri" w:cs="Calibri"/>
+          <w:sz w:val="24"/>
+          <w:szCs w:val="24"/>
+          <w:highlight w:val="yellow"/>
+        </w:rPr>
+        <w:br/>
+      </w:r>
+      <w:r>
+        <w:rPr>
+          <w:rFonts w:ascii="Calibri" w:hAnsi="Calibri" w:cs="Calibri"/>
+          <w:sz w:val="24"/>
+          <w:szCs w:val="24"/>
+          <w:highlight w:val="yellow"/>
+        </w:rPr>
+        <w:br/>
+        <w:t>2. How long have you lived in Melbourne/Victoria?</w:t>
+      </w:r>
+      <w:r>
+        <w:rPr>
+          <w:rFonts w:ascii="Calibri" w:hAnsi="Calibri" w:cs="Calibri"/>
+          <w:sz w:val="24"/>
+          <w:szCs w:val="24"/>
+          <w:highlight w:val="yellow"/>
+        </w:rPr>
+        <w:br/>
+      </w:r>
+      <w:r>
+        <w:rPr>
+          <w:rFonts w:ascii="Calibri" w:hAnsi="Calibri" w:cs="Calibri"/>
+          <w:sz w:val="24"/>
+          <w:szCs w:val="24"/>
+          <w:highlight w:val="yellow"/>
+        </w:rPr>
+        <w:br/>
+        <w:t>3. What year did you start supporting Chelsea FC?</w:t>
+      </w:r>
+      <w:r>
+        <w:rPr>
+          <w:rFonts w:ascii="Calibri" w:hAnsi="Calibri" w:cs="Calibri"/>
+          <w:sz w:val="24"/>
+          <w:szCs w:val="24"/>
+          <w:highlight w:val="yellow"/>
+        </w:rPr>
+        <w:br/>
+      </w:r>
+      <w:r>
+        <w:rPr>
+          <w:rFonts w:ascii="Calibri" w:hAnsi="Calibri" w:cs="Calibri"/>
+          <w:sz w:val="24"/>
+          <w:szCs w:val="24"/>
+          <w:highlight w:val="yellow"/>
+        </w:rPr>
+        <w:br/>
+        <w:t>4. Have you already been buying the paid membership with CFC in London on a regular basis?</w:t>
+      </w:r>
+      <w:r>
+        <w:rPr>
+          <w:rFonts w:ascii="Calibri" w:hAnsi="Calibri" w:cs="Calibri"/>
+          <w:sz w:val="24"/>
+          <w:szCs w:val="24"/>
+          <w:highlight w:val="yellow"/>
+        </w:rPr>
+        <w:br/>
+      </w:r>
+      <w:r>
+        <w:rPr>
+          <w:rFonts w:ascii="Calibri" w:hAnsi="Calibri" w:cs="Calibri"/>
+          <w:sz w:val="24"/>
+          <w:szCs w:val="24"/>
+          <w:highlight w:val="yellow"/>
+        </w:rPr>
+        <w:br/>
+        <w:t>6. Do you follow any of our social media? If yes, which ones and how long for.</w:t>
+      </w:r>
+      <w:r>
+        <w:rPr>
+          <w:rFonts w:ascii="Calibri" w:hAnsi="Calibri" w:cs="Calibri"/>
+          <w:sz w:val="24"/>
+          <w:szCs w:val="24"/>
+          <w:highlight w:val="yellow"/>
+        </w:rPr>
+        <w:br/>
+      </w:r>
+      <w:r>
+        <w:rPr>
+          <w:rFonts w:ascii="Calibri" w:hAnsi="Calibri" w:cs="Calibri"/>
+          <w:sz w:val="24"/>
+          <w:szCs w:val="24"/>
+          <w:highlight w:val="yellow"/>
+        </w:rPr>
+        <w:br/>
+      </w:r>
+      <w:r>
+        <w:rPr>
+          <w:rFonts w:ascii="Calibri" w:hAnsi="Calibri" w:cs="Calibri"/>
+          <w:sz w:val="24"/>
+          <w:szCs w:val="24"/>
+          <w:highlight w:val="yellow"/>
+        </w:rPr>
+        <w:br/>
+        <w:t>7. Have you been to our chosen pub to watch Chelsea on TV in the city</w:t>
+      </w:r>
+      <w:r>
+        <w:rPr>
+          <w:rFonts w:ascii="Calibri" w:hAnsi="Calibri" w:cs="Calibri"/>
+          <w:sz w:val="24"/>
+          <w:szCs w:val="24"/>
+          <w:highlight w:val="yellow"/>
+        </w:rPr>
+        <w:t xml:space="preserve"> over previous seasons (if you’re old enough</w:t>
+      </w:r>
+      <w:proofErr w:type="gramStart"/>
+      <w:r>
+        <w:rPr>
+          <w:rFonts w:ascii="Calibri" w:hAnsi="Calibri" w:cs="Calibri"/>
+          <w:sz w:val="24"/>
+          <w:szCs w:val="24"/>
+          <w:highlight w:val="yellow"/>
+        </w:rPr>
+        <w:t xml:space="preserve">) </w:t>
+      </w:r>
+      <w:r>
+        <w:rPr>
+          <w:rFonts w:ascii="Calibri" w:hAnsi="Calibri" w:cs="Calibri"/>
+          <w:sz w:val="24"/>
+          <w:szCs w:val="24"/>
+          <w:highlight w:val="yellow"/>
+        </w:rPr>
+        <w:t>?</w:t>
+      </w:r>
+      <w:proofErr w:type="gramEnd"/>
+    </w:p>
+    <w:p>
+      <w:pPr>
+        <w:pStyle w:val="Heading3"/>
+        <w:shd w:val="clear" w:color="auto" w:fill="FFFFFF"/>
+        <w:spacing w:line="300" w:lineRule="atLeast"/>
+        <w:jc w:val="center"/>
+        <w:rPr>
+          <w:rFonts w:ascii="Acme" w:hAnsi="Acme"/>
+          <w:color w:val="365F91" w:themeColor="accent1" w:themeShade="BF"/>
+          <w:sz w:val="24"/>
+          <w:szCs w:val="24"/>
+        </w:rPr>
+      </w:pPr>
+      <w:r>
+        <w:rPr>
+          <w:rFonts w:ascii="Calibri" w:hAnsi="Calibri" w:cs="Calibri"/>
+          <w:sz w:val="24"/>
+          <w:szCs w:val="24"/>
+        </w:rPr>
+        <w:br/>
+      </w:r>
+    </w:p>
+    <w:p>
+      <w:pPr>
+        <w:pStyle w:val="Heading3"/>
+        <w:shd w:val="clear" w:color="auto" w:fill="FFFFFF"/>
+        <w:spacing w:line="300" w:lineRule="atLeast"/>
+        <w:rPr>
+          <w:rFonts w:ascii="Acme" w:hAnsi="Acme"/>
+          <w:color w:val="365F91" w:themeColor="accent1" w:themeShade="BF"/>
+          <w:sz w:val="24"/>
+          <w:szCs w:val="24"/>
+        </w:rPr>
+      </w:pPr>
+      <w:r>
+        <w:rPr>
+          <w:rFonts w:ascii="Calibri" w:hAnsi="Calibri" w:cs="Calibri"/>
+          <w:sz w:val="24"/>
+          <w:szCs w:val="24"/>
+          <w:highlight w:val="yellow"/>
+        </w:rPr>
+        <w:t>8. If you’re only asking to join now (and lived in Melbourne a while), with a view to get ticket assistance this season, then why have you not joined locally before now?</w:t>
+      </w:r>
+      <w:r>
+        <w:rPr>
+          <w:rFonts w:ascii="Calibri" w:hAnsi="Calibri" w:cs="Calibri"/>
+          <w:sz w:val="24"/>
+          <w:szCs w:val="24"/>
+        </w:rPr>
+        <w:t xml:space="preserve"> </w:t>
+      </w:r>
+      <w:r>
+        <w:rPr>
+          <w:rFonts w:ascii="Calibri" w:hAnsi="Calibri" w:cs="Calibri"/>
+          <w:sz w:val="24"/>
+          <w:szCs w:val="24"/>
+        </w:rPr>
+        <w:br/>
+      </w:r>
+    </w:p>
+    <w:p>
+      <w:pPr>
+        <w:pStyle w:val="Heading3"/>
+        <w:shd w:val="clear" w:color="auto" w:fill="FFFFFF"/>
+        <w:spacing w:line="300" w:lineRule="atLeast"/>
+        <w:rPr>
+          <w:rFonts w:ascii="Acme" w:hAnsi="Acme"/>
+          <w:color w:val="365F91" w:themeColor="accent1" w:themeShade="BF"/>
+          <w:sz w:val="28"/>
+          <w:szCs w:val="32"/>
+        </w:rPr>
+      </w:pPr>
+      <w:r>
+        <w:rPr>
+          <w:rFonts w:ascii="Acme" w:hAnsi="Acme"/>
+          <w:color w:val="365F91" w:themeColor="accent1" w:themeShade="BF"/>
+          <w:sz w:val="32"/>
+          <w:szCs w:val="40"/>
+        </w:rPr>
+        <w:br/>
+      </w:r>
+    </w:p>
+    <w:p>
+      <w:pPr>
+        <w:pStyle w:val="Heading3"/>
+        <w:shd w:val="clear" w:color="auto" w:fill="FFFFFF"/>
+        <w:spacing w:line="300" w:lineRule="atLeast"/>
+        <w:rPr>
+          <w:rFonts w:ascii="Acme" w:hAnsi="Acme"/>
+          <w:color w:val="365F91" w:themeColor="accent1" w:themeShade="BF"/>
+          <w:sz w:val="28"/>
+          <w:szCs w:val="32"/>
+        </w:rPr>
+      </w:pPr>
+    </w:p>
+    <w:p>
+      <w:pPr>
+        <w:pStyle w:val="Heading3"/>
+        <w:shd w:val="clear" w:color="auto" w:fill="FFFFFF"/>
+        <w:spacing w:line="300" w:lineRule="atLeast"/>
+        <w:rPr>
+          <w:rFonts w:ascii="Acme" w:hAnsi="Acme"/>
+          <w:color w:val="365F91" w:themeColor="accent1" w:themeShade="BF"/>
+          <w:sz w:val="28"/>
+          <w:szCs w:val="32"/>
+        </w:rPr>
+      </w:pPr>
+      <w:r>
+        <w:rPr>
+          <w:rFonts w:ascii="Acme" w:hAnsi="Acme"/>
+          <w:color w:val="365F91" w:themeColor="accent1" w:themeShade="BF"/>
+          <w:sz w:val="28"/>
+          <w:szCs w:val="32"/>
+        </w:rPr>
+        <w:lastRenderedPageBreak/>
+        <w:br/>
+      </w:r>
+      <w:r>
+        <w:rPr>
+          <w:rFonts w:ascii="Acme" w:hAnsi="Acme"/>
+          <w:color w:val="365F91" w:themeColor="accent1" w:themeShade="BF"/>
+          <w:sz w:val="28"/>
+          <w:szCs w:val="32"/>
+        </w:rPr>
+        <w:t xml:space="preserve"> </w:t>
+      </w:r>
+    </w:p>
+    <w:p>
+      <w:pPr>
+        <w:pStyle w:val="Heading3"/>
+        <w:shd w:val="clear" w:color="auto" w:fill="FFFFFF"/>
+        <w:spacing w:line="300" w:lineRule="atLeast"/>
+        <w:rPr>
+          <w:rFonts w:ascii="Acme" w:hAnsi="Acme"/>
+          <w:color w:val="365F91" w:themeColor="accent1" w:themeShade="BF"/>
+          <w:sz w:val="40"/>
+          <w:szCs w:val="40"/>
+        </w:rPr>
+      </w:pPr>
       <w:r>
         <w:rPr>
           <w:rFonts w:ascii="Acme" w:hAnsi="Acme"/>
@@ -1035,6 +1359,7 @@
         </w:rPr>
         <w:t xml:space="preserve">and </w:t>
       </w:r>
+      <w:proofErr w:type="gramStart"/>
       <w:r>
         <w:rPr>
           <w:rFonts w:ascii="Acme" w:hAnsi="Acme"/>
@@ -1094,6 +1419,7 @@
         </w:rPr>
         <w:t>@chelseafcinmelbourne.com</w:t>
       </w:r>
+      <w:proofErr w:type="gramEnd"/>
       <w:r>
         <w:rPr>
           <w:rFonts w:ascii="Acme" w:hAnsi="Acme"/>
@@ -1213,7 +1539,6 @@
           <w:sz w:val="28"/>
           <w:szCs w:val="32"/>
         </w:rPr>
-        <w:lastRenderedPageBreak/>
         <w:t>If you are a member with CFC in London</w:t>
       </w:r>
       <w:r>
@@ -1858,7 +2183,7 @@
               </wp:anchor>
             </w:drawing>
           </mc:Choice>
-          <mc:Fallback>
+          <mc:Fallback xmlns:w16cei="http://schemas.microsoft.com/office/word/2026/wordml/cei">
             <w:pict>
               <v:shapetype w14:anchorId="599C423B" id="_x0000_t202" coordsize="21600,21600" o:spt="202" path="m,l,21600r21600,l21600,xe">
                 <v:stroke joinstyle="miter"/>
@@ -2493,6 +2818,7 @@
           <w:t>admin@chelseafcinmelbourne.com</w:t>
         </w:r>
       </w:hyperlink>
+      <w:proofErr w:type="gramStart"/>
       <w:r>
         <w:rPr>
           <w:rFonts w:ascii="Acme" w:hAnsi="Acme"/>
@@ -2510,7 +2836,17 @@
           <w:sz w:val="28"/>
           <w:szCs w:val="28"/>
         </w:rPr>
-        <w:t xml:space="preserve">“Friends” </w:t>
+        <w:t>“</w:t>
+      </w:r>
+      <w:proofErr w:type="gramEnd"/>
+      <w:r>
+        <w:rPr>
+          <w:rFonts w:ascii="Acme" w:hAnsi="Acme"/>
+          <w:i/>
+          <w:sz w:val="28"/>
+          <w:szCs w:val="28"/>
+        </w:rPr>
+        <w:t xml:space="preserve">Friends” </w:t>
       </w:r>
       <w:r>
         <w:rPr>
@@ -2722,7 +3058,7 @@
 </file>
 
 <file path=word/numbering.xml><?xml version="1.0" encoding="utf-8"?>
-<w:numbering xmlns:wpc="http://schemas.microsoft.com/office/word/2010/wordprocessingCanvas" xmlns:cx="http://schemas.microsoft.com/office/drawing/2014/chartex" xmlns:cx1="http://schemas.microsoft.com/office/drawing/2015/9/8/chartex" xmlns:cx2="http://schemas.microsoft.com/office/drawing/2015/10/21/chartex" xmlns:cx3="http://schemas.microsoft.com/office/drawing/2016/5/9/chartex" xmlns:cx4="http://schemas.microsoft.com/office/drawing/2016/5/10/chartex" xmlns:cx5="http://schemas.microsoft.com/office/drawing/2016/5/11/chartex" xmlns:cx6="http://schemas.microsoft.com/office/drawing/2016/5/12/chartex" xmlns:cx7="http://schemas.microsoft.com/office/drawing/2016/5/13/chartex" xmlns:cx8="http://schemas.microsoft.com/office/drawing/2016/5/14/chartex" xmlns:mc="http://schemas.openxmlformats.org/markup-compatibility/2006" xmlns:aink="http://schemas.microsoft.com/office/drawing/2016/ink" xmlns:am3d="http://schemas.microsoft.com/office/drawing/2017/model3d" xmlns:o="urn:schemas-microsoft-com:office:office" xmlns:oel="http://schemas.microsoft.com/office/2019/extlst" xmlns:r="http://schemas.openxmlformats.org/officeDocument/2006/relationships" xmlns:m="http://schemas.openxmlformats.org/officeDocument/2006/math" xmlns:v="urn:schemas-microsoft-com:vml" xmlns:wp14="http://schemas.microsoft.com/office/word/2010/wordprocessingDrawing" xmlns:wp="http://schemas.openxmlformats.org/drawingml/2006/wordprocessingDrawing" xmlns:w10="urn:schemas-microsoft-com:office:word" xmlns:w="http://schemas.openxmlformats.org/wordprocessingml/2006/main" xmlns:w14="http://schemas.microsoft.com/office/word/2010/wordml" xmlns:w15="http://schemas.microsoft.com/office/word/2012/wordml" xmlns:w16cei="http://schemas.microsoft.com/office/word/2026/wordml/cei" xmlns:w16cex="http://schemas.microsoft.com/office/word/2018/wordml/cex" xmlns:w16cid="http://schemas.microsoft.com/office/word/2016/wordml/cid" xmlns:w16="http://schemas.microsoft.com/office/word/2018/wordml" xmlns:w16du="http://schemas.microsoft.com/office/word/2023/wordml/word16du" xmlns:w16sdtdh="http://schemas.microsoft.com/office/word/2020/wordml/sdtdatahash" xmlns:w16sdtfl="http://schemas.microsoft.com/office/word/2024/wordml/sdtformatlock" xmlns:w16se="http://schemas.microsoft.com/office/word/2015/wordml/symex" xmlns:wpg="http://schemas.microsoft.com/office/word/2010/wordprocessingGroup" xmlns:wpi="http://schemas.microsoft.com/office/word/2010/wordprocessingInk" xmlns:wne="http://schemas.microsoft.com/office/word/2006/wordml" xmlns:wps="http://schemas.microsoft.com/office/word/2010/wordprocessingShape" mc:Ignorable="w14 w15 w16se w16cid w16 w16cex w16sdtdh w16sdtfl w16du wp14">
+<w:numbering xmlns:wpc="http://schemas.microsoft.com/office/word/2010/wordprocessingCanvas" xmlns:cx="http://schemas.microsoft.com/office/drawing/2014/chartex" xmlns:cx1="http://schemas.microsoft.com/office/drawing/2015/9/8/chartex" xmlns:cx2="http://schemas.microsoft.com/office/drawing/2015/10/21/chartex" xmlns:cx3="http://schemas.microsoft.com/office/drawing/2016/5/9/chartex" xmlns:cx4="http://schemas.microsoft.com/office/drawing/2016/5/10/chartex" xmlns:cx5="http://schemas.microsoft.com/office/drawing/2016/5/11/chartex" xmlns:cx6="http://schemas.microsoft.com/office/drawing/2016/5/12/chartex" xmlns:cx7="http://schemas.microsoft.com/office/drawing/2016/5/13/chartex" xmlns:cx8="http://schemas.microsoft.com/office/drawing/2016/5/14/chartex" xmlns:mc="http://schemas.openxmlformats.org/markup-compatibility/2006" xmlns:aink="http://schemas.microsoft.com/office/drawing/2016/ink" xmlns:am3d="http://schemas.microsoft.com/office/drawing/2017/model3d" xmlns:o="urn:schemas-microsoft-com:office:office" xmlns:oel="http://schemas.microsoft.com/office/2019/extlst" xmlns:r="http://schemas.openxmlformats.org/officeDocument/2006/relationships" xmlns:m="http://schemas.openxmlformats.org/officeDocument/2006/math" xmlns:v="urn:schemas-microsoft-com:vml" xmlns:wp14="http://schemas.microsoft.com/office/word/2010/wordprocessingDrawing" xmlns:wp="http://schemas.openxmlformats.org/drawingml/2006/wordprocessingDrawing" xmlns:w10="urn:schemas-microsoft-com:office:word" xmlns:w="http://schemas.openxmlformats.org/wordprocessingml/2006/main" xmlns:w14="http://schemas.microsoft.com/office/word/2010/wordml" xmlns:w15="http://schemas.microsoft.com/office/word/2012/wordml" xmlns:w16cex="http://schemas.microsoft.com/office/word/2018/wordml/cex" xmlns:w16cid="http://schemas.microsoft.com/office/word/2016/wordml/cid" xmlns:w16="http://schemas.microsoft.com/office/word/2018/wordml" xmlns:w16du="http://schemas.microsoft.com/office/word/2023/wordml/word16du" xmlns:w16sdtdh="http://schemas.microsoft.com/office/word/2020/wordml/sdtdatahash" xmlns:w16sdtfl="http://schemas.microsoft.com/office/word/2024/wordml/sdtformatlock" xmlns:w16se="http://schemas.microsoft.com/office/word/2015/wordml/symex" xmlns:wpg="http://schemas.microsoft.com/office/word/2010/wordprocessingGroup" xmlns:wpi="http://schemas.microsoft.com/office/word/2010/wordprocessingInk" xmlns:wne="http://schemas.microsoft.com/office/word/2006/wordml" xmlns:wps="http://schemas.microsoft.com/office/word/2010/wordprocessingShape" mc:Ignorable="w14 w15 w16se w16cid w16 w16cex w16sdtdh w16sdtfl w16du wp14">
   <w:abstractNum w:abstractNumId="0" w15:restartNumberingAfterBreak="0">
     <w:nsid w:val="22997D24"/>
     <w:multiLevelType w:val="hybridMultilevel"/>

</xml_diff>

<commit_message>
Update Membership Doc. Add: New Scarf Image, Everton Away Post
</commit_message>
<xml_diff>
--- a/assets/2026.27MembershipformYOURNAMEv2.docx
+++ b/assets/2026.27MembershipformYOURNAMEv2.docx
@@ -1026,8 +1026,41 @@
       <w:r>
         <w:rPr>
           <w:rFonts w:ascii="Calibri" w:hAnsi="Calibri" w:cs="Calibri"/>
-          <w:sz w:val="24"/>
-          <w:szCs w:val="24"/>
+          <w:b w:val="0"/>
+          <w:bCs w:val="0"/>
+          <w:sz w:val="20"/>
+          <w:szCs w:val="20"/>
+        </w:rPr>
+        <w:t>Please note that after 30</w:t>
+      </w:r>
+      <w:r>
+        <w:rPr>
+          <w:rFonts w:ascii="Calibri" w:hAnsi="Calibri" w:cs="Calibri"/>
+          <w:b w:val="0"/>
+          <w:bCs w:val="0"/>
+          <w:sz w:val="20"/>
+          <w:szCs w:val="20"/>
+          <w:vertAlign w:val="superscript"/>
+        </w:rPr>
+        <w:t>th</w:t>
+      </w:r>
+      <w:r>
+        <w:rPr>
+          <w:rFonts w:ascii="Calibri" w:hAnsi="Calibri" w:cs="Calibri"/>
+          <w:b w:val="0"/>
+          <w:bCs w:val="0"/>
+          <w:sz w:val="20"/>
+          <w:szCs w:val="20"/>
+        </w:rPr>
+        <w:t xml:space="preserve"> Sept we cannot assist</w:t>
+      </w:r>
+      <w:r>
+        <w:rPr>
+          <w:rFonts w:ascii="Calibri" w:hAnsi="Calibri" w:cs="Calibri"/>
+          <w:b w:val="0"/>
+          <w:bCs w:val="0"/>
+          <w:sz w:val="20"/>
+          <w:szCs w:val="20"/>
         </w:rPr>
         <w:br/>
       </w:r>
@@ -2183,13 +2216,9 @@
               </wp:anchor>
             </w:drawing>
           </mc:Choice>
-          <mc:Fallback xmlns:w16cei="http://schemas.microsoft.com/office/word/2026/wordml/cei">
+          <mc:Fallback>
             <w:pict>
-              <v:shapetype w14:anchorId="599C423B" id="_x0000_t202" coordsize="21600,21600" o:spt="202" path="m,l,21600r21600,l21600,xe">
-                <v:stroke joinstyle="miter"/>
-                <v:path gradientshapeok="t" o:connecttype="rect"/>
-              </v:shapetype>
-              <v:shape id="Text Box 2" o:spid="_x0000_s1026" type="#_x0000_t202" style="position:absolute;left:0;text-align:left;margin-left:-5pt;margin-top:1.15pt;width:263.7pt;height:20.85pt;z-index:251658752;visibility:visible;mso-wrap-style:square;mso-width-percent:0;mso-height-percent:0;mso-wrap-distance-left:9pt;mso-wrap-distance-top:0;mso-wrap-distance-right:9pt;mso-wrap-distance-bottom:0;mso-position-horizontal:absolute;mso-position-horizontal-relative:text;mso-position-vertical:absolute;mso-position-vertical-relative:text;mso-width-percent:0;mso-height-percent:0;mso-width-relative:margin;mso-height-relative:margin;v-text-anchor:top" o:gfxdata="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" fillcolor="white [3201]" stroked="f" strokeweight=".5pt">
+              <v:shape w14:anchorId="599C423B" id="_x0000_s1027" type="#_x0000_t202" style="position:absolute;left:0;text-align:left;margin-left:-5pt;margin-top:1.15pt;width:263.7pt;height:20.85pt;z-index:251658752;visibility:visible;mso-wrap-style:square;mso-width-percent:0;mso-height-percent:0;mso-wrap-distance-left:9pt;mso-wrap-distance-top:0;mso-wrap-distance-right:9pt;mso-wrap-distance-bottom:0;mso-position-horizontal:absolute;mso-position-horizontal-relative:text;mso-position-vertical:absolute;mso-position-vertical-relative:text;mso-width-percent:0;mso-height-percent:0;mso-width-relative:margin;mso-height-relative:margin;v-text-anchor:top" o:gfxdata="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" fillcolor="white [3201]" stroked="f" strokeweight=".5pt">
                 <v:textbox>
                   <w:txbxContent>
                     <w:p>

</xml_diff>